<commit_message>
run56: harden runtime and publish post-1948 V4
</commit_message>
<xml_diff>
--- a/examples/sri_lanka_pre_1948/09_output/Sri_Lanka_Fresque_historico_geographique_vol_retour_v4.docx
+++ b/examples/sri_lanka_pre_1948/09_output/Sri_Lanka_Fresque_historico_geographique_vol_retour_v4.docx
@@ -1331,13 +1331,9 @@
       </w:r>
     </w:p>
     <w:p>
-      <w:r>
-        <w:br w:type="page"/>
-      </w:r>
-    </w:p>
-    <w:p>
       <w:pPr>
         <w:pStyle w:val="Heading1"/>
+        <w:pageBreakBefore/>
       </w:pPr>
       <w:r>
         <w:rPr>
@@ -4148,13 +4144,9 @@
       </w:r>
     </w:p>
     <w:p>
-      <w:r>
-        <w:br w:type="page"/>
-      </w:r>
-    </w:p>
-    <w:p>
       <w:pPr>
         <w:pStyle w:val="Heading1"/>
+        <w:pageBreakBefore/>
       </w:pPr>
       <w:r>
         <w:rPr>
@@ -7243,13 +7235,9 @@
       </w:pPr>
     </w:p>
     <w:p>
-      <w:r>
-        <w:br w:type="page"/>
-      </w:r>
-    </w:p>
-    <w:p>
       <w:pPr>
         <w:pStyle w:val="Heading1"/>
+        <w:pageBreakBefore/>
       </w:pPr>
       <w:r>
         <w:rPr>
@@ -8882,13 +8870,9 @@
       </w:r>
     </w:p>
     <w:p>
-      <w:r>
-        <w:br w:type="page"/>
-      </w:r>
-    </w:p>
-    <w:p>
       <w:pPr>
         <w:pStyle w:val="Heading1"/>
+        <w:pageBreakBefore/>
       </w:pPr>
       <w:r>
         <w:rPr>
@@ -10031,13 +10015,9 @@
       </w:r>
     </w:p>
     <w:p>
-      <w:r>
-        <w:br w:type="page"/>
-      </w:r>
-    </w:p>
-    <w:p>
       <w:pPr>
         <w:pStyle w:val="Heading1"/>
+        <w:pageBreakBefore/>
       </w:pPr>
       <w:r>
         <w:rPr>
@@ -10830,13 +10810,9 @@
       </w:r>
     </w:p>
     <w:p>
-      <w:r>
-        <w:br w:type="page"/>
-      </w:r>
-    </w:p>
-    <w:p>
       <w:pPr>
         <w:pStyle w:val="Heading1"/>
+        <w:pageBreakBefore/>
       </w:pPr>
       <w:r>
         <w:rPr>
@@ -11826,13 +11802,9 @@
       </w:r>
     </w:p>
     <w:p>
-      <w:r>
-        <w:br w:type="page"/>
-      </w:r>
-    </w:p>
-    <w:p>
       <w:pPr>
         <w:pStyle w:val="Heading1"/>
+        <w:pageBreakBefore/>
       </w:pPr>
       <w:r>
         <w:rPr>
@@ -14092,13 +14064,9 @@
       </w:r>
     </w:p>
     <w:p>
-      <w:r>
-        <w:br w:type="page"/>
-      </w:r>
-    </w:p>
-    <w:p>
       <w:pPr>
         <w:pStyle w:val="Heading1"/>
+        <w:pageBreakBefore/>
       </w:pPr>
       <w:r>
         <w:rPr>
@@ -15084,13 +15052,9 @@
       </w:r>
     </w:p>
     <w:p>
-      <w:r>
-        <w:br w:type="page"/>
-      </w:r>
-    </w:p>
-    <w:p>
       <w:pPr>
         <w:pStyle w:val="Heading1"/>
+        <w:pageBreakBefore/>
       </w:pPr>
       <w:r>
         <w:rPr>
@@ -15581,13 +15545,9 @@
       </w:r>
     </w:p>
     <w:p>
-      <w:r>
-        <w:br w:type="page"/>
-      </w:r>
-    </w:p>
-    <w:p>
       <w:pPr>
         <w:pStyle w:val="Heading1"/>
+        <w:pageBreakBefore/>
       </w:pPr>
       <w:r>
         <w:rPr>
@@ -16085,13 +16045,9 @@
       </w:r>
     </w:p>
     <w:p>
-      <w:r>
-        <w:br w:type="page"/>
-      </w:r>
-    </w:p>
-    <w:p>
       <w:pPr>
         <w:pStyle w:val="Heading1"/>
+        <w:pageBreakBefore/>
       </w:pPr>
       <w:r>
         <w:rPr>
@@ -16906,13 +16862,9 @@
       </w:r>
     </w:p>
     <w:p>
-      <w:r>
-        <w:br w:type="page"/>
-      </w:r>
-    </w:p>
-    <w:p>
       <w:pPr>
         <w:pStyle w:val="Heading1"/>
+        <w:pageBreakBefore/>
       </w:pPr>
       <w:r>
         <w:rPr>

</xml_diff>

<commit_message>
Merge RUN56 runtime retex and post-1948 V4 (#97)
Harden context accounting, side-story disposition, question and graph diagnostics, and publish both visually validated V4 Word readers.
</commit_message>
<xml_diff>
--- a/examples/sri_lanka_pre_1948/09_output/Sri_Lanka_Fresque_historico_geographique_vol_retour_v4.docx
+++ b/examples/sri_lanka_pre_1948/09_output/Sri_Lanka_Fresque_historico_geographique_vol_retour_v4.docx
@@ -1331,13 +1331,9 @@
       </w:r>
     </w:p>
     <w:p>
-      <w:r>
-        <w:br w:type="page"/>
-      </w:r>
-    </w:p>
-    <w:p>
       <w:pPr>
         <w:pStyle w:val="Heading1"/>
+        <w:pageBreakBefore/>
       </w:pPr>
       <w:r>
         <w:rPr>
@@ -4148,13 +4144,9 @@
       </w:r>
     </w:p>
     <w:p>
-      <w:r>
-        <w:br w:type="page"/>
-      </w:r>
-    </w:p>
-    <w:p>
       <w:pPr>
         <w:pStyle w:val="Heading1"/>
+        <w:pageBreakBefore/>
       </w:pPr>
       <w:r>
         <w:rPr>
@@ -7243,13 +7235,9 @@
       </w:pPr>
     </w:p>
     <w:p>
-      <w:r>
-        <w:br w:type="page"/>
-      </w:r>
-    </w:p>
-    <w:p>
       <w:pPr>
         <w:pStyle w:val="Heading1"/>
+        <w:pageBreakBefore/>
       </w:pPr>
       <w:r>
         <w:rPr>
@@ -8882,13 +8870,9 @@
       </w:r>
     </w:p>
     <w:p>
-      <w:r>
-        <w:br w:type="page"/>
-      </w:r>
-    </w:p>
-    <w:p>
       <w:pPr>
         <w:pStyle w:val="Heading1"/>
+        <w:pageBreakBefore/>
       </w:pPr>
       <w:r>
         <w:rPr>
@@ -10031,13 +10015,9 @@
       </w:r>
     </w:p>
     <w:p>
-      <w:r>
-        <w:br w:type="page"/>
-      </w:r>
-    </w:p>
-    <w:p>
       <w:pPr>
         <w:pStyle w:val="Heading1"/>
+        <w:pageBreakBefore/>
       </w:pPr>
       <w:r>
         <w:rPr>
@@ -10830,13 +10810,9 @@
       </w:r>
     </w:p>
     <w:p>
-      <w:r>
-        <w:br w:type="page"/>
-      </w:r>
-    </w:p>
-    <w:p>
       <w:pPr>
         <w:pStyle w:val="Heading1"/>
+        <w:pageBreakBefore/>
       </w:pPr>
       <w:r>
         <w:rPr>
@@ -11826,13 +11802,9 @@
       </w:r>
     </w:p>
     <w:p>
-      <w:r>
-        <w:br w:type="page"/>
-      </w:r>
-    </w:p>
-    <w:p>
       <w:pPr>
         <w:pStyle w:val="Heading1"/>
+        <w:pageBreakBefore/>
       </w:pPr>
       <w:r>
         <w:rPr>
@@ -14092,13 +14064,9 @@
       </w:r>
     </w:p>
     <w:p>
-      <w:r>
-        <w:br w:type="page"/>
-      </w:r>
-    </w:p>
-    <w:p>
       <w:pPr>
         <w:pStyle w:val="Heading1"/>
+        <w:pageBreakBefore/>
       </w:pPr>
       <w:r>
         <w:rPr>
@@ -15084,13 +15052,9 @@
       </w:r>
     </w:p>
     <w:p>
-      <w:r>
-        <w:br w:type="page"/>
-      </w:r>
-    </w:p>
-    <w:p>
       <w:pPr>
         <w:pStyle w:val="Heading1"/>
+        <w:pageBreakBefore/>
       </w:pPr>
       <w:r>
         <w:rPr>
@@ -15581,13 +15545,9 @@
       </w:r>
     </w:p>
     <w:p>
-      <w:r>
-        <w:br w:type="page"/>
-      </w:r>
-    </w:p>
-    <w:p>
       <w:pPr>
         <w:pStyle w:val="Heading1"/>
+        <w:pageBreakBefore/>
       </w:pPr>
       <w:r>
         <w:rPr>
@@ -16085,13 +16045,9 @@
       </w:r>
     </w:p>
     <w:p>
-      <w:r>
-        <w:br w:type="page"/>
-      </w:r>
-    </w:p>
-    <w:p>
       <w:pPr>
         <w:pStyle w:val="Heading1"/>
+        <w:pageBreakBefore/>
       </w:pPr>
       <w:r>
         <w:rPr>
@@ -16906,13 +16862,9 @@
       </w:r>
     </w:p>
     <w:p>
-      <w:r>
-        <w:br w:type="page"/>
-      </w:r>
-    </w:p>
-    <w:p>
       <w:pPr>
         <w:pStyle w:val="Heading1"/>
+        <w:pageBreakBefore/>
       </w:pPr>
       <w:r>
         <w:rPr>

</xml_diff>